<commit_message>
docs: add pitch deck link and live demo URL to README and documentation
</commit_message>
<xml_diff>
--- a/README.docx
+++ b/README.docx
@@ -197,49 +197,7 @@
         </w:rPr>
       </w:pPr>
       <w:r>
-        <w:rPr>
-          <w:b/>
-        </w:rPr>
-        <w:t>🌐</w:t>
-      </w:r>
-      <w:r>
-        <w:rPr>
-          <w:b/>
-          <w:lang w:val="ru-RU"/>
-        </w:rPr>
-        <w:t xml:space="preserve"> Рабочий </w:t>
-      </w:r>
-      <w:r>
-        <w:rPr>
-          <w:b/>
-        </w:rPr>
-        <w:t>Live</w:t>
-      </w:r>
-      <w:r>
-        <w:rPr>
-          <w:b/>
-          <w:lang w:val="ru-RU"/>
-        </w:rPr>
-        <w:t xml:space="preserve"> </w:t>
-      </w:r>
-      <w:r>
-        <w:rPr>
-          <w:b/>
-        </w:rPr>
-        <w:t>MVP</w:t>
-      </w:r>
-      <w:r>
-        <w:rPr>
-          <w:b/>
-          <w:lang w:val="ru-RU"/>
-        </w:rPr>
-        <w:t xml:space="preserve"> (деплой): </w:t>
-      </w:r>
-      <w:r>
-        <w:rPr>
-          <w:lang w:val="ru-RU"/>
-        </w:rPr>
-        <w:t>[ВСТАВЬТЕ_ССЫЛКУ_НА_ВЕБ_ДЕПЛОЙ]</w:t>
+        <w:t>🌐 Рабочий Live MVP (деплой): https://follow-anybody-original-antenna.trycloudflare.com</w:t>
       </w:r>
     </w:p>
     <w:p>

</xml_diff>

<commit_message>
docs: set public GitHub repository link in documentation
</commit_message>
<xml_diff>
--- a/README.docx
+++ b/README.docx
@@ -147,45 +147,7 @@
         </w:rPr>
       </w:pPr>
       <w:r>
-        <w:rPr>
-          <w:b/>
-        </w:rPr>
-        <w:t>💻</w:t>
-      </w:r>
-      <w:r>
-        <w:rPr>
-          <w:b/>
-          <w:lang w:val="ru-RU"/>
-        </w:rPr>
-        <w:t xml:space="preserve"> Публичный репозиторий с кодом (</w:t>
-      </w:r>
-      <w:r>
-        <w:rPr>
-          <w:b/>
-        </w:rPr>
-        <w:t>GitHub</w:t>
-      </w:r>
-      <w:r>
-        <w:rPr>
-          <w:b/>
-          <w:lang w:val="ru-RU"/>
-        </w:rPr>
-        <w:t xml:space="preserve">): </w:t>
-      </w:r>
-      <w:r>
-        <w:rPr>
-          <w:lang w:val="ru-RU"/>
-        </w:rPr>
-        <w:t>[ВСТАВЬТЕ_ССЫЛКУ_НА_</w:t>
-      </w:r>
-      <w:r>
-        <w:t>GITHUB</w:t>
-      </w:r>
-      <w:r>
-        <w:rPr>
-          <w:lang w:val="ru-RU"/>
-        </w:rPr>
-        <w:t>]</w:t>
+        <w:t>💻 Публичный репозиторий с кодом (GitHub): https://github.com/A2L0D1I0/zerde-platform</w:t>
       </w:r>
     </w:p>
     <w:p>

</xml_diff>